<commit_message>
OV04 v3 build: off-text CPAP-adherence finding (KM08-v7) - plain prompt, plain OSA line, golden+grader re-anchored to the compliance report, transfer-day nursing breadcrumb, Codex image spec; verify_ondina + presubmit green
</commit_message>
<xml_diff>
--- a/worlds/ondina-vasquell/phase-3-build-task-artifacts/platform/task4/current/golden-OV04-v1.docx
+++ b/worlds/ondina-vasquell/phase-3-build-task-artifacts/platform/task4/current/golden-OV04-v1.docx
@@ -710,7 +710,7 @@
           <w:color w:val="232830"/>
           <w:sz w:val="19"/>
         </w:rPr>
-        <w:t>Obstructive sleep apnea: continues on home CPAP. This admission did not include a sleep-medicine review, CPAP titration, or documented adherence verification, so OSA control is not established this stay. Continue home CPAP at the facility and arrange outpatient sleep-medicine follow-up to verify settings and adherence; do not document OSA as reviewed or controlled this admission.</w:t>
+        <w:t>Obstructive sleep apnea: continues on home CPAP, but the device compliance report brought on transfer day shows poor adherence (average use about 1.4 hours per night, used on 9 of the last 30 nights) with an elevated residual apnea-hypopnea index (about 31 per hour), so OSA is undertreated and control is not established this stay. Continue home CPAP and arrange outpatient sleep-medicine follow-up to address adherence and re-titrate settings; do not document OSA as controlled.</w:t>
       </w:r>
     </w:p>
     <w:p>
@@ -858,7 +858,7 @@
           <w:color w:val="232830"/>
           <w:sz w:val="19"/>
         </w:rPr>
-        <w:t>Basal-bolus insulin with point-of-care glucose monitoring; continue nightly home CPAP.</w:t>
+        <w:t>Basal-bolus insulin with point-of-care glucose monitoring; continue nightly home CPAP with adherence support.</w:t>
       </w:r>
     </w:p>
     <w:p>
@@ -988,7 +988,7 @@
           <w:color w:val="232830"/>
           <w:sz w:val="19"/>
         </w:rPr>
-        <w:t>Sleep medicine (outpatient): verify CPAP settings and adherence; OSA control was not established this admission.</w:t>
+        <w:t>Sleep medicine (outpatient): address poor CPAP adherence and re-titrate settings per the device compliance report; OSA is undertreated and was not controlled this admission.</w:t>
       </w:r>
     </w:p>
     <w:p>
@@ -1018,7 +1018,7 @@
           <w:color w:val="232830"/>
           <w:sz w:val="19"/>
         </w:rPr>
-        <w:t>The started draft asserted that home CPAP was reviewed and adherence verified this admission with obstructive sleep apnea controlled; the record does not support that (no inpatient sleep study, titration, or adherence documentation). Corrected to keep obstructive sleep apnea management open with outpatient sleep-medicine follow-up before signature.</w:t>
+        <w:t>The CPAP device compliance report brought on transfer day shows poor adherence and an elevated residual apnea-hypopnea index; obstructive sleep apnea is undertreated this stay. The completed note keeps OSA open with outpatient sleep-medicine follow-up to address adherence and settings, and does not document OSA as controlled on home CPAP.</w:t>
       </w:r>
     </w:p>
     <w:p>

</xml_diff>